<commit_message>
display paragraph on index
</commit_message>
<xml_diff>
--- a/docxToTxt/READING TEST 5 - KEY.docx
+++ b/docxToTxt/READING TEST 5 - KEY.docx
@@ -119,24 +119,6 @@
       <w:r>
         <w:rPr>
           <w:rFonts w:ascii="Times New Roman" w:hAnsi="Times New Roman" w:cs="Times New Roman"/>
-          <w:b/>
-          <w:sz w:val="28"/>
-          <w:szCs w:val="28"/>
-        </w:rPr>
-        <w:t xml:space="preserve">READING PASSAGE </w:t>
-      </w:r>
-      <w:r>
-        <w:rPr>
-          <w:rFonts w:ascii="Times New Roman" w:hAnsi="Times New Roman" w:cs="Times New Roman"/>
-          <w:b/>
-          <w:sz w:val="28"/>
-          <w:szCs w:val="28"/>
-        </w:rPr>
-        <w:t xml:space="preserve">2 </w:t>
-      </w:r>
-      <w:r>
-        <w:rPr>
-          <w:rFonts w:ascii="Times New Roman" w:hAnsi="Times New Roman" w:cs="Times New Roman"/>
           <w:sz w:val="24"/>
           <w:szCs w:val="24"/>
         </w:rPr>
@@ -165,8 +147,6 @@
       <w:r>
         <w:rPr>
           <w:rFonts w:ascii="Times New Roman" w:hAnsi="Times New Roman" w:cs="Times New Roman"/>
-          <w:b/>
-          <w:bCs/>
           <w:sz w:val="24"/>
           <w:szCs w:val="24"/>
         </w:rPr>

</xml_diff>